<commit_message>
Guida cassa: corregge punto 3 Buono Volontario
Il sistema scala automaticamente fino al totale — non c'è inserimento manuale dell'importo.

Co-Authored-By: Claude Sonnet 4.6 <noreply@anthropic.com>
</commit_message>
<xml_diff>
--- a/guide/Guida_Rapida_Cassa.docx
+++ b/guide/Guida_Rapida_Cassa.docx
@@ -226,20 +226,7 @@
         <w:spacing w:before="20" w:after="20"/>
       </w:pPr>
       <w:r>
-        <w:t>Sezione Buono Volontario: seleziona il volontario — il saldo residuo appare in tempo reale</w:t>
-      </w:r>
-    </w:p>
-    <w:p>
-      <w:pPr>
-        <w:pStyle w:val="Paragrafoelenco"/>
-        <w:numPr>
-          <w:ilvl w:val="0"/>
-          <w:numId w:val="3"/>
-        </w:numPr>
-        <w:spacing w:before="20" w:after="20"/>
-      </w:pPr>
-      <w:r>
-        <w:t>Inserisci l'importo da scalare (massimo = saldo disponibile)</w:t>
+        <w:t>Sezione Buono Volontario: seleziona il volontario — il sistema scala automaticamente fino al valore totale dello scontrino</w:t>
       </w:r>
     </w:p>
     <w:p>

</xml_diff>

<commit_message>
Guida cassa: omaggio singola riga è sulla riga dello scontrino, non dallo storico
Co-Authored-By: Claude Sonnet 4.6 <noreply@anthropic.com>
</commit_message>
<xml_diff>
--- a/guide/Guida_Rapida_Cassa.docx
+++ b/guide/Guida_Rapida_Cassa.docx
@@ -178,7 +178,7 @@
         <w:spacing w:before="100" w:after="40"/>
       </w:pPr>
       <w:r>
-        <w:t>Singola riga (da Storico)</w:t>
+        <w:t>Singola riga</w:t>
       </w:r>
     </w:p>
     <w:p>
@@ -191,7 +191,7 @@
         <w:spacing w:before="20" w:after="20"/>
       </w:pPr>
       <w:r>
-        <w:t>Storico → seleziona scontrino → icona omaggio sulla riga interessata</w:t>
+        <w:t>Clicca l'icona omaggio direttamente sulla riga del prodotto nello scontrino</w:t>
       </w:r>
     </w:p>
     <w:p>

</xml_diff>